<commit_message>
Updated .docx and .pdf
</commit_message>
<xml_diff>
--- a/ТО А.Н. Поршнев.docx
+++ b/ТО А.Н. Поршнев.docx
@@ -2010,8 +2010,9 @@
         <w:rPr>
           <w:rFonts w:ascii="Times New Roman" w:hAnsi="Times New Roman"/>
           <w:sz w:val="28"/>
-        </w:rPr>
-        <w:t>системой контроля версий</w:t>
+          <w:lang w:val="en-US"/>
+        </w:rPr>
+        <w:t>VCS</w:t>
       </w:r>
       <w:r>
         <w:rPr>
@@ -2556,8 +2557,68 @@
         <w:rPr>
           <w:rFonts w:ascii="Times New Roman" w:hAnsi="Times New Roman"/>
           <w:sz w:val="28"/>
+        </w:rPr>
+      </w:pPr>
+      <w:r>
+        <w:rPr>
+          <w:rFonts w:ascii="Times New Roman" w:hAnsi="Times New Roman"/>
+          <w:sz w:val="28"/>
           <w:lang w:val="en-US"/>
         </w:rPr>
+        <w:t>IDE</w:t>
+      </w:r>
+      <w:r>
+        <w:rPr>
+          <w:rFonts w:ascii="Times New Roman" w:hAnsi="Times New Roman"/>
+          <w:sz w:val="28"/>
+        </w:rPr>
+        <w:t xml:space="preserve"> – </w:t>
+      </w:r>
+      <w:r>
+        <w:rPr>
+          <w:rFonts w:ascii="Times New Roman" w:hAnsi="Times New Roman"/>
+          <w:sz w:val="28"/>
+        </w:rPr>
+        <w:t>интегрированная</w:t>
+      </w:r>
+      <w:r>
+        <w:rPr>
+          <w:rFonts w:ascii="Times New Roman" w:hAnsi="Times New Roman"/>
+          <w:sz w:val="28"/>
+        </w:rPr>
+        <w:t xml:space="preserve"> </w:t>
+      </w:r>
+      <w:r>
+        <w:rPr>
+          <w:rFonts w:ascii="Times New Roman" w:hAnsi="Times New Roman"/>
+          <w:sz w:val="28"/>
+        </w:rPr>
+        <w:t>среда</w:t>
+      </w:r>
+      <w:r>
+        <w:rPr>
+          <w:rFonts w:ascii="Times New Roman" w:hAnsi="Times New Roman"/>
+          <w:sz w:val="28"/>
+        </w:rPr>
+        <w:t xml:space="preserve"> </w:t>
+      </w:r>
+      <w:r>
+        <w:rPr>
+          <w:rFonts w:ascii="Times New Roman" w:hAnsi="Times New Roman"/>
+          <w:sz w:val="28"/>
+        </w:rPr>
+        <w:t>разработки</w:t>
+      </w:r>
+    </w:p>
+    <w:p>
+      <w:pPr>
+        <w:spacing w:after="0" w:line="360" w:lineRule="auto"/>
+        <w:ind w:firstLine="709"/>
+        <w:jc w:val="both"/>
+        <w:rPr>
+          <w:rFonts w:ascii="Times New Roman" w:hAnsi="Times New Roman"/>
+          <w:sz w:val="28"/>
+        </w:rPr>
       </w:pPr>
       <w:r>
         <w:rPr>
@@ -2565,64 +2626,92 @@
           <w:sz w:val="28"/>
           <w:lang w:val="en-US"/>
         </w:rPr>
-        <w:t xml:space="preserve">IDE – </w:t>
-      </w:r>
-      <w:r>
-        <w:rPr>
-          <w:rFonts w:ascii="Times New Roman" w:hAnsi="Times New Roman"/>
-          <w:sz w:val="28"/>
-        </w:rPr>
-        <w:t>интегрированная</w:t>
-      </w:r>
-      <w:r>
+        <w:t>VCS</w:t>
+      </w:r>
+      <w:r>
+        <w:rPr>
+          <w:rFonts w:ascii="Times New Roman" w:hAnsi="Times New Roman"/>
+          <w:sz w:val="28"/>
+        </w:rPr>
+        <w:t xml:space="preserve"> – </w:t>
+      </w:r>
+      <w:r>
+        <w:rPr>
+          <w:rFonts w:ascii="Times New Roman" w:hAnsi="Times New Roman"/>
+          <w:sz w:val="28"/>
+        </w:rPr>
+        <w:t>система</w:t>
+      </w:r>
+      <w:r>
+        <w:rPr>
+          <w:rFonts w:ascii="Times New Roman" w:hAnsi="Times New Roman"/>
+          <w:sz w:val="28"/>
+        </w:rPr>
+        <w:t xml:space="preserve"> </w:t>
+      </w:r>
+      <w:r>
+        <w:rPr>
+          <w:rFonts w:ascii="Times New Roman" w:hAnsi="Times New Roman"/>
+          <w:sz w:val="28"/>
+        </w:rPr>
+        <w:t>контроля</w:t>
+      </w:r>
+      <w:r>
+        <w:rPr>
+          <w:rFonts w:ascii="Times New Roman" w:hAnsi="Times New Roman"/>
+          <w:sz w:val="28"/>
+        </w:rPr>
+        <w:t xml:space="preserve"> </w:t>
+      </w:r>
+      <w:r>
+        <w:rPr>
+          <w:rFonts w:ascii="Times New Roman" w:hAnsi="Times New Roman"/>
+          <w:sz w:val="28"/>
+        </w:rPr>
+        <w:t>версий</w:t>
+      </w:r>
+    </w:p>
+    <w:p>
+      <w:pPr>
+        <w:spacing w:after="0" w:line="360" w:lineRule="auto"/>
+        <w:ind w:firstLine="709"/>
+        <w:jc w:val="both"/>
         <w:rPr>
           <w:rFonts w:ascii="Times New Roman" w:hAnsi="Times New Roman"/>
           <w:sz w:val="28"/>
           <w:lang w:val="en-US"/>
         </w:rPr>
+      </w:pPr>
+      <w:r>
+        <w:rPr>
+          <w:rFonts w:ascii="Times New Roman" w:hAnsi="Times New Roman"/>
+          <w:sz w:val="28"/>
+          <w:lang w:val="en-US"/>
+        </w:rPr>
+        <w:t xml:space="preserve">WPF – </w:t>
+      </w:r>
+      <w:r>
+        <w:rPr>
+          <w:rFonts w:ascii="Times New Roman" w:hAnsi="Times New Roman"/>
+          <w:sz w:val="28"/>
+        </w:rPr>
+        <w:t xml:space="preserve">платформа для построения графических интерфейсов </w:t>
+      </w:r>
+      <w:r>
+        <w:rPr>
+          <w:rFonts w:ascii="Times New Roman" w:hAnsi="Times New Roman"/>
+          <w:sz w:val="28"/>
+          <w:lang w:val="en-US"/>
+        </w:rPr>
+        <w:t>Windows</w:t>
+      </w:r>
+      <w:r>
+        <w:rPr>
+          <w:rFonts w:ascii="Times New Roman" w:hAnsi="Times New Roman"/>
+          <w:sz w:val="28"/>
+          <w:lang w:val="en-US"/>
+        </w:rPr>
         <w:t xml:space="preserve"> </w:t>
-      </w:r>
-      <w:r>
-        <w:rPr>
-          <w:rFonts w:ascii="Times New Roman" w:hAnsi="Times New Roman"/>
-          <w:sz w:val="28"/>
-        </w:rPr>
-        <w:t>среда</w:t>
-      </w:r>
-      <w:r>
-        <w:rPr>
-          <w:rFonts w:ascii="Times New Roman" w:hAnsi="Times New Roman"/>
-          <w:sz w:val="28"/>
-          <w:lang w:val="en-US"/>
-        </w:rPr>
-        <w:t xml:space="preserve"> </w:t>
-      </w:r>
-      <w:r>
-        <w:rPr>
-          <w:rFonts w:ascii="Times New Roman" w:hAnsi="Times New Roman"/>
-          <w:sz w:val="28"/>
-        </w:rPr>
-        <w:t>разработки</w:t>
-      </w:r>
-    </w:p>
-    <w:p>
-      <w:pPr>
-        <w:spacing w:after="0" w:line="360" w:lineRule="auto"/>
-        <w:ind w:firstLine="709"/>
-        <w:jc w:val="both"/>
-        <w:rPr>
-          <w:rFonts w:ascii="Times New Roman" w:hAnsi="Times New Roman"/>
-          <w:sz w:val="28"/>
-          <w:lang w:val="en-US"/>
-        </w:rPr>
-      </w:pPr>
-      <w:r>
-        <w:rPr>
-          <w:rFonts w:ascii="Times New Roman" w:hAnsi="Times New Roman"/>
-          <w:sz w:val="28"/>
-          <w:lang w:val="en-US"/>
-        </w:rPr>
-        <w:t xml:space="preserve">WPF – Windows Presentation Foundation </w:t>
       </w:r>
     </w:p>
     <w:p>
@@ -2885,7 +2974,22 @@
           <w:rFonts w:ascii="Times New Roman" w:hAnsi="Times New Roman"/>
           <w:sz w:val="28"/>
         </w:rPr>
-        <w:t>использовать системы контроля версий,</w:t>
+        <w:t xml:space="preserve">использовать </w:t>
+      </w:r>
+      <w:r>
+        <w:rPr>
+          <w:rFonts w:ascii="Times New Roman" w:hAnsi="Times New Roman"/>
+          <w:sz w:val="28"/>
+          <w:lang w:val="en-US"/>
+        </w:rPr>
+        <w:t>VCS</w:t>
+      </w:r>
+      <w:r>
+        <w:rPr>
+          <w:rFonts w:ascii="Times New Roman" w:hAnsi="Times New Roman"/>
+          <w:sz w:val="28"/>
+        </w:rPr>
+        <w:t>,</w:t>
       </w:r>
     </w:p>
     <w:p>
@@ -3368,7 +3472,25 @@
           <w:sz w:val="28"/>
           <w:lang w:val="en-US"/>
         </w:rPr>
-        <w:t xml:space="preserve"> Microsoft Office, Microsoft Edge, Visual Studio 2022.</w:t>
+        <w:t xml:space="preserve"> Microsoft Office, Microsoft Edge,</w:t>
+      </w:r>
+      <w:r>
+        <w:rPr>
+          <w:rFonts w:ascii="Times New Roman" w:hAnsi="Times New Roman"/>
+          <w:color w:val="000000" w:themeColor="text1"/>
+          <w:sz w:val="28"/>
+          <w:lang w:val="en-US"/>
+        </w:rPr>
+        <w:t xml:space="preserve"> Microsoft </w:t>
+      </w:r>
+      <w:r>
+        <w:rPr>
+          <w:rFonts w:ascii="Times New Roman" w:hAnsi="Times New Roman"/>
+          <w:color w:val="000000" w:themeColor="text1"/>
+          <w:sz w:val="28"/>
+          <w:lang w:val="en-US"/>
+        </w:rPr>
+        <w:t>Visual Studio 2022.</w:t>
       </w:r>
     </w:p>
     <w:p>
@@ -5084,6 +5206,22 @@
           <w:bCs/>
           <w:sz w:val="28"/>
         </w:rPr>
+        <w:t xml:space="preserve"> </w:t>
+      </w:r>
+      <w:r>
+        <w:rPr>
+          <w:rFonts w:ascii="Times New Roman" w:hAnsi="Times New Roman"/>
+          <w:bCs/>
+          <w:sz w:val="28"/>
+        </w:rPr>
+        <w:t>[2]</w:t>
+      </w:r>
+      <w:r>
+        <w:rPr>
+          <w:rFonts w:ascii="Times New Roman" w:hAnsi="Times New Roman"/>
+          <w:bCs/>
+          <w:sz w:val="28"/>
+        </w:rPr>
         <w:t xml:space="preserve"> и</w:t>
       </w:r>
       <w:r>
@@ -5100,7 +5238,23 @@
           <w:bCs/>
           <w:sz w:val="28"/>
         </w:rPr>
-        <w:t xml:space="preserve"> интуитивно понятный интерфейс для </w:t>
+        <w:t xml:space="preserve"> интуитивно понятный интерфейс</w:t>
+      </w:r>
+      <w:r>
+        <w:rPr>
+          <w:rFonts w:ascii="Times New Roman" w:hAnsi="Times New Roman"/>
+          <w:bCs/>
+          <w:sz w:val="28"/>
+        </w:rPr>
+        <w:t xml:space="preserve"> [4]</w:t>
+      </w:r>
+      <w:r>
+        <w:rPr>
+          <w:rFonts w:ascii="Times New Roman" w:hAnsi="Times New Roman"/>
+          <w:bCs/>
+          <w:sz w:val="28"/>
+        </w:rPr>
+        <w:t xml:space="preserve"> для </w:t>
       </w:r>
       <w:r>
         <w:rPr>
@@ -5600,6 +5754,14 @@
           <w:bCs/>
           <w:sz w:val="28"/>
         </w:rPr>
+        <w:t xml:space="preserve"> [5]</w:t>
+      </w:r>
+      <w:r>
+        <w:rPr>
+          <w:rFonts w:ascii="Times New Roman" w:hAnsi="Times New Roman"/>
+          <w:bCs/>
+          <w:sz w:val="28"/>
+        </w:rPr>
         <w:t xml:space="preserve"> в </w:t>
       </w:r>
       <w:r>
@@ -6076,8 +6238,9 @@
           <w:rFonts w:ascii="Times New Roman" w:hAnsi="Times New Roman"/>
           <w:b/>
           <w:sz w:val="28"/>
-        </w:rPr>
-        <w:t>системой контроля версий</w:t>
+          <w:lang w:val="en-US"/>
+        </w:rPr>
+        <w:t>VCS</w:t>
       </w:r>
       <w:r>
         <w:rPr>
@@ -6125,16 +6288,32 @@
           <w:rFonts w:ascii="Times New Roman" w:hAnsi="Times New Roman"/>
           <w:bCs/>
           <w:sz w:val="28"/>
+        </w:rPr>
+      </w:pPr>
+      <w:r>
+        <w:rPr>
+          <w:rFonts w:ascii="Times New Roman" w:hAnsi="Times New Roman"/>
+          <w:bCs/>
+          <w:sz w:val="28"/>
+        </w:rPr>
+        <w:t xml:space="preserve">В процессе разработки ПО для контроля версий использовалась распределённая </w:t>
+      </w:r>
+      <w:r>
+        <w:rPr>
+          <w:rFonts w:ascii="Times New Roman" w:hAnsi="Times New Roman"/>
+          <w:bCs/>
+          <w:sz w:val="28"/>
           <w:lang w:val="en-US"/>
         </w:rPr>
-      </w:pPr>
-      <w:r>
-        <w:rPr>
-          <w:rFonts w:ascii="Times New Roman" w:hAnsi="Times New Roman"/>
-          <w:bCs/>
-          <w:sz w:val="28"/>
-        </w:rPr>
-        <w:t xml:space="preserve">В процессе разработки ПО для контроля версий использовалась распределённая система контроля версий </w:t>
+        <w:t>VCS</w:t>
+      </w:r>
+      <w:r>
+        <w:rPr>
+          <w:rFonts w:ascii="Times New Roman" w:hAnsi="Times New Roman"/>
+          <w:bCs/>
+          <w:sz w:val="28"/>
+        </w:rPr>
+        <w:t xml:space="preserve"> </w:t>
       </w:r>
       <w:r>
         <w:rPr>
@@ -6470,7 +6649,6 @@
           <w:rFonts w:ascii="Times New Roman" w:hAnsi="Times New Roman"/>
           <w:bCs/>
           <w:sz w:val="28"/>
-          <w:lang w:val="en-US"/>
         </w:rPr>
       </w:pPr>
       <w:r>
@@ -6649,7 +6827,31 @@
           <w:bCs/>
           <w:sz w:val="28"/>
         </w:rPr>
-        <w:t xml:space="preserve">Для отладки кода использовались встроенные инструменты </w:t>
+        <w:t>Для отладки</w:t>
+      </w:r>
+      <w:r>
+        <w:rPr>
+          <w:rFonts w:ascii="Times New Roman" w:hAnsi="Times New Roman"/>
+          <w:bCs/>
+          <w:sz w:val="28"/>
+        </w:rPr>
+        <w:t xml:space="preserve"> </w:t>
+      </w:r>
+      <w:r>
+        <w:rPr>
+          <w:rFonts w:ascii="Times New Roman" w:hAnsi="Times New Roman"/>
+          <w:bCs/>
+          <w:sz w:val="28"/>
+        </w:rPr>
+        <w:t>[3]</w:t>
+      </w:r>
+      <w:r>
+        <w:rPr>
+          <w:rFonts w:ascii="Times New Roman" w:hAnsi="Times New Roman"/>
+          <w:bCs/>
+          <w:sz w:val="28"/>
+        </w:rPr>
+        <w:t xml:space="preserve"> кода использовались встроенные инструменты </w:t>
       </w:r>
       <w:r>
         <w:rPr>
@@ -7005,7 +7207,31 @@
           <w:bCs/>
           <w:sz w:val="28"/>
         </w:rPr>
-        <w:t>Для проверки предсказуемости поведения программы необходимо провести тестирование по методологии «чёрного ящика». В таблице 1 представлен набор тестов для программы мониторинга дискового пространства.</w:t>
+        <w:t>Для проверки предсказуемости поведения программы необходимо провести тестирование</w:t>
+      </w:r>
+      <w:r>
+        <w:rPr>
+          <w:rFonts w:ascii="Times New Roman" w:hAnsi="Times New Roman"/>
+          <w:bCs/>
+          <w:sz w:val="28"/>
+        </w:rPr>
+        <w:t xml:space="preserve"> </w:t>
+      </w:r>
+      <w:r>
+        <w:rPr>
+          <w:rFonts w:ascii="Times New Roman" w:hAnsi="Times New Roman"/>
+          <w:bCs/>
+          <w:sz w:val="28"/>
+        </w:rPr>
+        <w:t>[1]</w:t>
+      </w:r>
+      <w:r>
+        <w:rPr>
+          <w:rFonts w:ascii="Times New Roman" w:hAnsi="Times New Roman"/>
+          <w:bCs/>
+          <w:sz w:val="28"/>
+        </w:rPr>
+        <w:t xml:space="preserve"> по методологии «чёрного ящика». В таблице 1 представлен набор тестов для программы мониторинга дискового пространства.</w:t>
       </w:r>
     </w:p>
     <w:p>
@@ -9021,7 +9247,7 @@
     </w:p>
     <w:p>
       <w:pPr>
-        <w:spacing w:after="0" w:line="360" w:lineRule="auto"/>
+        <w:spacing w:after="0" w:line="240" w:lineRule="auto"/>
         <w:contextualSpacing/>
         <w:jc w:val="center"/>
         <w:rPr>
@@ -9440,7 +9666,7 @@
           <w:color w:val="000000"/>
           <w:sz w:val="28"/>
           <w:szCs w:val="28"/>
-          <w:lang w:val="en-US" w:eastAsia="ru-RU"/>
+          <w:lang w:eastAsia="ru-RU"/>
         </w:rPr>
       </w:pPr>
       <w:r>
@@ -9485,25 +9711,7 @@
           <w:sz w:val="28"/>
           <w:szCs w:val="28"/>
         </w:rPr>
-        <w:t xml:space="preserve">Для интерфейса </w:t>
-      </w:r>
-      <w:r>
-        <w:rPr>
-          <w:rFonts w:ascii="Times New Roman" w:hAnsi="Times New Roman" w:cs="Times New Roman"/>
-          <w:bCs/>
-          <w:sz w:val="28"/>
-          <w:szCs w:val="28"/>
-        </w:rPr>
-        <w:t>программы</w:t>
-      </w:r>
-      <w:r>
-        <w:rPr>
-          <w:rFonts w:ascii="Times New Roman" w:hAnsi="Times New Roman" w:cs="Times New Roman"/>
-          <w:bCs/>
-          <w:sz w:val="28"/>
-          <w:szCs w:val="28"/>
-        </w:rPr>
-        <w:t xml:space="preserve"> выбрана следующая цветовая палитра:</w:t>
+        <w:t>Для интерфейса программы выбрана следующая цветовая палитра:</w:t>
       </w:r>
     </w:p>
     <w:p>
@@ -9561,25 +9769,7 @@
           <w:sz w:val="28"/>
           <w:szCs w:val="28"/>
         </w:rPr>
-        <w:t xml:space="preserve"> цвет</w:t>
-      </w:r>
-      <w:r>
-        <w:rPr>
-          <w:rFonts w:ascii="Times New Roman" w:hAnsi="Times New Roman" w:cs="Times New Roman"/>
-          <w:bCs/>
-          <w:sz w:val="28"/>
-          <w:szCs w:val="28"/>
-        </w:rPr>
-        <w:t xml:space="preserve"> подписей кнопок</w:t>
-      </w:r>
-      <w:r>
-        <w:rPr>
-          <w:rFonts w:ascii="Times New Roman" w:hAnsi="Times New Roman" w:cs="Times New Roman"/>
-          <w:bCs/>
-          <w:sz w:val="28"/>
-          <w:szCs w:val="28"/>
-        </w:rPr>
-        <w:t>,</w:t>
+        <w:t xml:space="preserve"> цвет подписей кнопок,</w:t>
       </w:r>
     </w:p>
     <w:p>
@@ -9638,16 +9828,7 @@
           <w:sz w:val="28"/>
           <w:szCs w:val="28"/>
         </w:rPr>
-        <w:t xml:space="preserve"> – </w:t>
-      </w:r>
-      <w:r>
-        <w:rPr>
-          <w:rFonts w:ascii="Times New Roman" w:hAnsi="Times New Roman" w:cs="Times New Roman"/>
-          <w:bCs/>
-          <w:sz w:val="28"/>
-          <w:szCs w:val="28"/>
-        </w:rPr>
-        <w:t>цвет фона,</w:t>
+        <w:t xml:space="preserve"> – цвет фона,</w:t>
       </w:r>
     </w:p>
     <w:p>
@@ -9688,16 +9869,7 @@
           <w:sz w:val="28"/>
           <w:szCs w:val="28"/>
         </w:rPr>
-        <w:t>000000 – цвет текста</w:t>
-      </w:r>
-      <w:r>
-        <w:rPr>
-          <w:rFonts w:ascii="Times New Roman" w:hAnsi="Times New Roman" w:cs="Times New Roman"/>
-          <w:bCs/>
-          <w:sz w:val="28"/>
-          <w:szCs w:val="28"/>
-        </w:rPr>
-        <w:t>,</w:t>
+        <w:t>000000 – цвет текста,</w:t>
       </w:r>
     </w:p>
     <w:p>
@@ -9736,7 +9908,7 @@
           <w:sz w:val="28"/>
           <w:szCs w:val="28"/>
         </w:rPr>
-        <w:t>1928dc</w:t>
+        <w:t xml:space="preserve">1928dc </w:t>
       </w:r>
       <w:r>
         <w:rPr>
@@ -9745,43 +9917,7 @@
           <w:sz w:val="28"/>
           <w:szCs w:val="28"/>
         </w:rPr>
-        <w:t xml:space="preserve"> </w:t>
-      </w:r>
-      <w:r>
-        <w:rPr>
-          <w:rFonts w:ascii="Times New Roman" w:hAnsi="Times New Roman" w:cs="Times New Roman"/>
-          <w:bCs/>
-          <w:sz w:val="28"/>
-          <w:szCs w:val="28"/>
-        </w:rPr>
-        <w:t>–</w:t>
-      </w:r>
-      <w:r>
-        <w:rPr>
-          <w:rFonts w:ascii="Times New Roman" w:hAnsi="Times New Roman" w:cs="Times New Roman"/>
-          <w:bCs/>
-          <w:sz w:val="28"/>
-          <w:szCs w:val="28"/>
-        </w:rPr>
-        <w:t xml:space="preserve"> </w:t>
-      </w:r>
-      <w:r>
-        <w:rPr>
-          <w:rFonts w:ascii="Times New Roman" w:hAnsi="Times New Roman" w:cs="Times New Roman"/>
-          <w:bCs/>
-          <w:sz w:val="28"/>
-          <w:szCs w:val="28"/>
-        </w:rPr>
-        <w:t>цвет кнопок</w:t>
-      </w:r>
-      <w:r>
-        <w:rPr>
-          <w:rFonts w:ascii="Times New Roman" w:hAnsi="Times New Roman" w:cs="Times New Roman"/>
-          <w:bCs/>
-          <w:sz w:val="28"/>
-          <w:szCs w:val="28"/>
-        </w:rPr>
-        <w:t>,</w:t>
+        <w:t>– цвет кнопок,</w:t>
       </w:r>
     </w:p>
     <w:p>
@@ -9820,7 +9956,7 @@
           <w:sz w:val="28"/>
           <w:szCs w:val="28"/>
         </w:rPr>
-        <w:t>87cefa</w:t>
+        <w:t xml:space="preserve">87cefa </w:t>
       </w:r>
       <w:r>
         <w:rPr>
@@ -9829,25 +9965,7 @@
           <w:sz w:val="28"/>
           <w:szCs w:val="28"/>
         </w:rPr>
-        <w:t xml:space="preserve"> </w:t>
-      </w:r>
-      <w:r>
-        <w:rPr>
-          <w:rFonts w:ascii="Times New Roman" w:hAnsi="Times New Roman" w:cs="Times New Roman"/>
-          <w:bCs/>
-          <w:sz w:val="28"/>
-          <w:szCs w:val="28"/>
-        </w:rPr>
-        <w:t>– вторичный цвет кнопок</w:t>
-      </w:r>
-      <w:r>
-        <w:rPr>
-          <w:rFonts w:ascii="Times New Roman" w:hAnsi="Times New Roman" w:cs="Times New Roman"/>
-          <w:bCs/>
-          <w:sz w:val="28"/>
-          <w:szCs w:val="28"/>
-        </w:rPr>
-        <w:t>.</w:t>
+        <w:t>– вторичный цвет кнопок.</w:t>
       </w:r>
     </w:p>
     <w:p>
@@ -10042,9 +10160,9 @@
         </w:rPr>
         <w:lastRenderedPageBreak/>
         <w:drawing>
-          <wp:inline distT="0" distB="0" distL="0" distR="0" wp14:anchorId="4ACEE43A" wp14:editId="26153755">
-            <wp:extent cx="5155055" cy="2905125"/>
-            <wp:effectExtent l="0" t="0" r="7620" b="0"/>
+          <wp:inline distT="0" distB="0" distL="0" distR="0" wp14:anchorId="4ACEE43A" wp14:editId="728EF089">
+            <wp:extent cx="5307172" cy="2990850"/>
+            <wp:effectExtent l="0" t="0" r="8255" b="0"/>
             <wp:docPr id="934115575" name="Рисунок 1"/>
             <wp:cNvGraphicFramePr>
               <a:graphicFrameLocks xmlns:a="http://schemas.openxmlformats.org/drawingml/2006/main" noChangeAspect="1"/>
@@ -10065,7 +10183,7 @@
                   <pic:spPr>
                     <a:xfrm>
                       <a:off x="0" y="0"/>
-                      <a:ext cx="5266721" cy="2968054"/>
+                      <a:ext cx="5427791" cy="3058825"/>
                     </a:xfrm>
                     <a:prstGeom prst="rect">
                       <a:avLst/>
@@ -10099,7 +10217,7 @@
     </w:p>
     <w:p>
       <w:pPr>
-        <w:spacing w:after="0" w:line="360" w:lineRule="auto"/>
+        <w:spacing w:after="0" w:line="240" w:lineRule="auto"/>
         <w:contextualSpacing/>
         <w:jc w:val="center"/>
         <w:rPr>
@@ -10185,8 +10303,8 @@
           <w:lang w:eastAsia="ru-RU"/>
         </w:rPr>
         <w:drawing>
-          <wp:inline distT="0" distB="0" distL="0" distR="0" wp14:anchorId="27EA5ED4" wp14:editId="227B6301">
-            <wp:extent cx="5152231" cy="2905125"/>
+          <wp:inline distT="0" distB="0" distL="0" distR="0" wp14:anchorId="27EA5ED4" wp14:editId="40E90F09">
+            <wp:extent cx="5304263" cy="2990850"/>
             <wp:effectExtent l="0" t="0" r="0" b="0"/>
             <wp:docPr id="1825079386" name="Рисунок 1"/>
             <wp:cNvGraphicFramePr>
@@ -10208,7 +10326,7 @@
                   <pic:spPr>
                     <a:xfrm>
                       <a:off x="0" y="0"/>
-                      <a:ext cx="5166896" cy="2913394"/>
+                      <a:ext cx="5321536" cy="3000590"/>
                     </a:xfrm>
                     <a:prstGeom prst="rect">
                       <a:avLst/>
@@ -10238,7 +10356,7 @@
     </w:p>
     <w:p>
       <w:pPr>
-        <w:spacing w:after="0" w:line="360" w:lineRule="auto"/>
+        <w:spacing w:after="0" w:line="240" w:lineRule="auto"/>
         <w:contextualSpacing/>
         <w:jc w:val="center"/>
         <w:rPr>
@@ -10314,7 +10432,7 @@
           <w:color w:val="000000"/>
           <w:sz w:val="28"/>
           <w:szCs w:val="28"/>
-          <w:lang w:val="en-US" w:eastAsia="ru-RU"/>
+          <w:lang w:eastAsia="ru-RU"/>
         </w:rPr>
       </w:pPr>
       <w:r>
@@ -10399,8 +10517,8 @@
         </w:rPr>
         <w:lastRenderedPageBreak/>
         <w:drawing>
-          <wp:inline distT="0" distB="0" distL="0" distR="0" wp14:anchorId="63CF4868" wp14:editId="1712A540">
-            <wp:extent cx="5983241" cy="3371850"/>
+          <wp:inline distT="0" distB="0" distL="0" distR="0" wp14:anchorId="63CF4868" wp14:editId="59F91598">
+            <wp:extent cx="6118456" cy="3448050"/>
             <wp:effectExtent l="0" t="0" r="0" b="0"/>
             <wp:docPr id="897995752" name="Рисунок 1"/>
             <wp:cNvGraphicFramePr>
@@ -10422,7 +10540,7 @@
                   <pic:spPr>
                     <a:xfrm>
                       <a:off x="0" y="0"/>
-                      <a:ext cx="6029046" cy="3397663"/>
+                      <a:ext cx="6168966" cy="3476515"/>
                     </a:xfrm>
                     <a:prstGeom prst="rect">
                       <a:avLst/>
@@ -10456,7 +10574,7 @@
     </w:p>
     <w:p>
       <w:pPr>
-        <w:spacing w:after="0" w:line="360" w:lineRule="auto"/>
+        <w:spacing w:after="0" w:line="240" w:lineRule="auto"/>
         <w:contextualSpacing/>
         <w:jc w:val="center"/>
         <w:rPr>
@@ -10465,7 +10583,7 @@
           <w:color w:val="000000"/>
           <w:sz w:val="28"/>
           <w:szCs w:val="28"/>
-          <w:lang w:val="en-US" w:eastAsia="ru-RU"/>
+          <w:lang w:eastAsia="ru-RU"/>
         </w:rPr>
       </w:pPr>
       <w:r>
@@ -10513,7 +10631,7 @@
           <w:color w:val="000000"/>
           <w:sz w:val="28"/>
           <w:szCs w:val="28"/>
-          <w:lang w:val="en-US" w:eastAsia="ru-RU"/>
+          <w:lang w:eastAsia="ru-RU"/>
         </w:rPr>
       </w:pPr>
     </w:p>
@@ -10542,9 +10660,9 @@
           <w:lang w:eastAsia="ru-RU"/>
         </w:rPr>
         <w:drawing>
-          <wp:inline distT="0" distB="0" distL="0" distR="0" wp14:anchorId="3473BE7A" wp14:editId="33EF7F05">
-            <wp:extent cx="5940425" cy="3347720"/>
-            <wp:effectExtent l="0" t="0" r="3175" b="5080"/>
+          <wp:inline distT="0" distB="0" distL="0" distR="0" wp14:anchorId="3473BE7A" wp14:editId="7004895C">
+            <wp:extent cx="6118457" cy="3448050"/>
+            <wp:effectExtent l="0" t="0" r="0" b="0"/>
             <wp:docPr id="123323768" name="Рисунок 1"/>
             <wp:cNvGraphicFramePr>
               <a:graphicFrameLocks xmlns:a="http://schemas.openxmlformats.org/drawingml/2006/main" noChangeAspect="1"/>
@@ -10565,7 +10683,7 @@
                   <pic:spPr>
                     <a:xfrm>
                       <a:off x="0" y="0"/>
-                      <a:ext cx="5940425" cy="3347720"/>
+                      <a:ext cx="6124825" cy="3451639"/>
                     </a:xfrm>
                     <a:prstGeom prst="rect">
                       <a:avLst/>
@@ -10595,7 +10713,7 @@
     </w:p>
     <w:p>
       <w:pPr>
-        <w:spacing w:after="0" w:line="360" w:lineRule="auto"/>
+        <w:spacing w:after="0" w:line="240" w:lineRule="auto"/>
         <w:contextualSpacing/>
         <w:jc w:val="center"/>
         <w:rPr>
@@ -10604,7 +10722,7 @@
           <w:color w:val="000000"/>
           <w:sz w:val="28"/>
           <w:szCs w:val="28"/>
-          <w:lang w:val="en-US" w:eastAsia="ru-RU"/>
+          <w:lang w:eastAsia="ru-RU"/>
         </w:rPr>
       </w:pPr>
       <w:r>
@@ -10640,6 +10758,25 @@
         </w:rPr>
         <w:t>– «Мониторинг дискового пространства». Вид вкладки «Очистка диска» после модификаций</w:t>
       </w:r>
+    </w:p>
+    <w:p>
+      <w:pPr>
+        <w:tabs>
+          <w:tab w:val="left" w:pos="900"/>
+        </w:tabs>
+        <w:spacing w:after="0" w:line="360" w:lineRule="auto"/>
+        <w:ind w:firstLine="709"/>
+        <w:contextualSpacing/>
+        <w:jc w:val="both"/>
+        <w:rPr>
+          <w:rFonts w:ascii="Times New Roman" w:eastAsia="Times New Roman" w:hAnsi="Times New Roman" w:cs="Times New Roman"/>
+          <w:b/>
+          <w:color w:val="000000"/>
+          <w:sz w:val="28"/>
+          <w:szCs w:val="28"/>
+          <w:lang w:eastAsia="ru-RU"/>
+        </w:rPr>
+      </w:pPr>
     </w:p>
     <w:p>
       <w:pPr>
@@ -10934,7 +11071,22 @@
           <w:rFonts w:ascii="Times New Roman" w:hAnsi="Times New Roman"/>
           <w:sz w:val="28"/>
         </w:rPr>
-        <w:t>использована система контроля версий,</w:t>
+        <w:t xml:space="preserve">использована </w:t>
+      </w:r>
+      <w:r>
+        <w:rPr>
+          <w:rFonts w:ascii="Times New Roman" w:hAnsi="Times New Roman"/>
+          <w:sz w:val="28"/>
+          <w:lang w:val="en-US"/>
+        </w:rPr>
+        <w:t>VCS</w:t>
+      </w:r>
+      <w:r>
+        <w:rPr>
+          <w:rFonts w:ascii="Times New Roman" w:hAnsi="Times New Roman"/>
+          <w:sz w:val="28"/>
+        </w:rPr>
+        <w:t>,</w:t>
       </w:r>
     </w:p>
     <w:p>
@@ -13329,6 +13481,7 @@
   <w:style w:type="character" w:default="1" w:styleId="a0">
     <w:name w:val="Default Paragraph Font"/>
     <w:uiPriority w:val="1"/>
+    <w:semiHidden/>
     <w:unhideWhenUsed/>
   </w:style>
   <w:style w:type="table" w:default="1" w:styleId="a1">

</xml_diff>